<commit_message>
fix(0101): Chuẩn hóa quy trình Đề 0101 - Cắt sạch 100% hình ảnh không dính chữ, build LaTeX pdflatex ra PDF, xuất bản Word BTPro
</commit_message>
<xml_diff>
--- a/pdf2word/San_Pham/de-khao-sat-toan-12-nam-2026-2027-truong-thpt-bao-thang-3-lao-cai_De_0101.docx
+++ b/pdf2word/San_Pham/de-khao-sat-toan-12-nam-2026-2027-truong-thpt-bao-thang-3-lao-cai_De_0101.docx
@@ -296,7 +296,7 @@
         </w:rPr>
         <w:drawing>
           <wp:inline>
-            <wp:extent cx="3420000" cy="920681"/>
+            <wp:extent cx="3420000" cy="1287327"/>
             <wp:docPr id="10" name="Picture 10"/>
             <wp:cNvGraphicFramePr>
               <a:graphicFrameLocks noChangeAspect="1"/>
@@ -317,7 +317,7 @@
                   <pic:spPr>
                     <a:xfrm>
                       <a:off x="0" y="0"/>
-                      <a:ext cx="3420000" cy="920681"/>
+                      <a:ext cx="3420000" cy="1287327"/>
                     </a:xfrm>
                     <a:prstGeom prst="rect"/>
                   </pic:spPr>
@@ -550,7 +550,7 @@
         </w:rPr>
         <w:drawing>
           <wp:inline>
-            <wp:extent cx="3420000" cy="918397"/>
+            <wp:extent cx="3420000" cy="1291619"/>
             <wp:docPr id="11" name="Picture 11"/>
             <wp:cNvGraphicFramePr>
               <a:graphicFrameLocks noChangeAspect="1"/>
@@ -571,7 +571,7 @@
                   <pic:spPr>
                     <a:xfrm>
                       <a:off x="0" y="0"/>
-                      <a:ext cx="3420000" cy="918397"/>
+                      <a:ext cx="3420000" cy="1291619"/>
                     </a:xfrm>
                     <a:prstGeom prst="rect"/>
                   </pic:spPr>
@@ -1127,7 +1127,7 @@
               </w:rPr>
               <w:drawing>
                 <wp:inline>
-                  <wp:extent cx="1872000" cy="743506"/>
+                  <wp:extent cx="1872000" cy="1588146"/>
                   <wp:docPr id="1" name="Picture 1"/>
                   <wp:cNvGraphicFramePr>
                     <a:graphicFrameLocks noChangeAspect="1"/>
@@ -1148,7 +1148,7 @@
                         <pic:spPr>
                           <a:xfrm>
                             <a:off x="0" y="0"/>
-                            <a:ext cx="1872000" cy="743506"/>
+                            <a:ext cx="1872000" cy="1588146"/>
                           </a:xfrm>
                           <a:prstGeom prst="rect"/>
                         </pic:spPr>
@@ -1538,7 +1538,7 @@
               </w:rPr>
               <w:drawing>
                 <wp:inline>
-                  <wp:extent cx="1872000" cy="617273"/>
+                  <wp:extent cx="1872000" cy="1561868"/>
                   <wp:docPr id="2" name="Picture 2"/>
                   <wp:cNvGraphicFramePr>
                     <a:graphicFrameLocks noChangeAspect="1"/>
@@ -1559,7 +1559,7 @@
                         <pic:spPr>
                           <a:xfrm>
                             <a:off x="0" y="0"/>
-                            <a:ext cx="1872000" cy="617273"/>
+                            <a:ext cx="1872000" cy="1561868"/>
                           </a:xfrm>
                           <a:prstGeom prst="rect"/>
                         </pic:spPr>
@@ -1924,7 +1924,7 @@
               </w:rPr>
               <w:drawing>
                 <wp:inline>
-                  <wp:extent cx="1800000" cy="782199"/>
+                  <wp:extent cx="1800000" cy="1785000"/>
                   <wp:docPr id="3" name="Picture 3"/>
                   <wp:cNvGraphicFramePr>
                     <a:graphicFrameLocks noChangeAspect="1"/>
@@ -1945,7 +1945,7 @@
                         <pic:spPr>
                           <a:xfrm>
                             <a:off x="0" y="0"/>
-                            <a:ext cx="1800000" cy="782199"/>
+                            <a:ext cx="1800000" cy="1785000"/>
                           </a:xfrm>
                           <a:prstGeom prst="rect"/>
                         </pic:spPr>
@@ -2449,7 +2449,7 @@
               </w:rPr>
               <w:drawing>
                 <wp:inline>
-                  <wp:extent cx="1800000" cy="708175"/>
+                  <wp:extent cx="1800000" cy="1441918"/>
                   <wp:docPr id="4" name="Picture 4"/>
                   <wp:cNvGraphicFramePr>
                     <a:graphicFrameLocks noChangeAspect="1"/>
@@ -2470,7 +2470,7 @@
                         <pic:spPr>
                           <a:xfrm>
                             <a:off x="0" y="0"/>
-                            <a:ext cx="1800000" cy="708175"/>
+                            <a:ext cx="1800000" cy="1441918"/>
                           </a:xfrm>
                           <a:prstGeom prst="rect"/>
                         </pic:spPr>
@@ -2721,7 +2721,7 @@
               </w:rPr>
               <w:drawing>
                 <wp:inline>
-                  <wp:extent cx="1800000" cy="748034"/>
+                  <wp:extent cx="1800000" cy="1866667"/>
                   <wp:docPr id="5" name="Picture 5"/>
                   <wp:cNvGraphicFramePr>
                     <a:graphicFrameLocks noChangeAspect="1"/>
@@ -2742,7 +2742,7 @@
                         <pic:spPr>
                           <a:xfrm>
                             <a:off x="0" y="0"/>
-                            <a:ext cx="1800000" cy="748034"/>
+                            <a:ext cx="1800000" cy="1866667"/>
                           </a:xfrm>
                           <a:prstGeom prst="rect"/>
                         </pic:spPr>
@@ -2863,7 +2863,7 @@
         </w:rPr>
         <w:drawing>
           <wp:inline>
-            <wp:extent cx="3420000" cy="1027398"/>
+            <wp:extent cx="3420000" cy="1312163"/>
             <wp:docPr id="12" name="Picture 12"/>
             <wp:cNvGraphicFramePr>
               <a:graphicFrameLocks noChangeAspect="1"/>
@@ -2884,7 +2884,7 @@
                   <pic:spPr>
                     <a:xfrm>
                       <a:off x="0" y="0"/>
-                      <a:ext cx="3420000" cy="1027398"/>
+                      <a:ext cx="3420000" cy="1312163"/>
                     </a:xfrm>
                     <a:prstGeom prst="rect"/>
                   </pic:spPr>
@@ -3348,7 +3348,7 @@
         </w:rPr>
         <w:drawing>
           <wp:inline>
-            <wp:extent cx="3420000" cy="788138"/>
+            <wp:extent cx="3420000" cy="949224"/>
             <wp:docPr id="13" name="Picture 13"/>
             <wp:cNvGraphicFramePr>
               <a:graphicFrameLocks noChangeAspect="1"/>
@@ -3369,7 +3369,7 @@
                   <pic:spPr>
                     <a:xfrm>
                       <a:off x="0" y="0"/>
-                      <a:ext cx="3420000" cy="788138"/>
+                      <a:ext cx="3420000" cy="949224"/>
                     </a:xfrm>
                     <a:prstGeom prst="rect"/>
                   </pic:spPr>
@@ -3882,7 +3882,7 @@
               </w:rPr>
               <w:drawing>
                 <wp:inline>
-                  <wp:extent cx="1800000" cy="751030"/>
+                  <wp:extent cx="1800000" cy="1646250"/>
                   <wp:docPr id="6" name="Picture 6"/>
                   <wp:cNvGraphicFramePr>
                     <a:graphicFrameLocks noChangeAspect="1"/>
@@ -3903,7 +3903,7 @@
                         <pic:spPr>
                           <a:xfrm>
                             <a:off x="0" y="0"/>
-                            <a:ext cx="1800000" cy="751030"/>
+                            <a:ext cx="1800000" cy="1646250"/>
                           </a:xfrm>
                           <a:prstGeom prst="rect"/>
                         </pic:spPr>
@@ -4353,7 +4353,7 @@
               </w:rPr>
               <w:drawing>
                 <wp:inline>
-                  <wp:extent cx="1800000" cy="732045"/>
+                  <wp:extent cx="1800000" cy="1758541"/>
                   <wp:docPr id="7" name="Picture 7"/>
                   <wp:cNvGraphicFramePr>
                     <a:graphicFrameLocks noChangeAspect="1"/>
@@ -4374,7 +4374,7 @@
                         <pic:spPr>
                           <a:xfrm>
                             <a:off x="0" y="0"/>
-                            <a:ext cx="1800000" cy="732045"/>
+                            <a:ext cx="1800000" cy="1758541"/>
                           </a:xfrm>
                           <a:prstGeom prst="rect"/>
                         </pic:spPr>
@@ -4823,7 +4823,7 @@
               </w:rPr>
               <w:drawing>
                 <wp:inline>
-                  <wp:extent cx="1800000" cy="896679"/>
+                  <wp:extent cx="1800000" cy="1716974"/>
                   <wp:docPr id="8" name="Picture 8"/>
                   <wp:cNvGraphicFramePr>
                     <a:graphicFrameLocks noChangeAspect="1"/>
@@ -4844,7 +4844,7 @@
                         <pic:spPr>
                           <a:xfrm>
                             <a:off x="0" y="0"/>
-                            <a:ext cx="1800000" cy="896679"/>
+                            <a:ext cx="1800000" cy="1716974"/>
                           </a:xfrm>
                           <a:prstGeom prst="rect"/>
                         </pic:spPr>
@@ -5305,7 +5305,7 @@
               </w:rPr>
               <w:drawing>
                 <wp:inline>
-                  <wp:extent cx="1872000" cy="773248"/>
+                  <wp:extent cx="1872000" cy="1887600"/>
                   <wp:docPr id="9" name="Picture 9"/>
                   <wp:cNvGraphicFramePr>
                     <a:graphicFrameLocks noChangeAspect="1"/>
@@ -5326,7 +5326,7 @@
                         <pic:spPr>
                           <a:xfrm>
                             <a:off x="0" y="0"/>
-                            <a:ext cx="1872000" cy="773248"/>
+                            <a:ext cx="1872000" cy="1887600"/>
                           </a:xfrm>
                           <a:prstGeom prst="rect"/>
                         </pic:spPr>
@@ -5646,7 +5646,7 @@
         </w:rPr>
         <w:drawing>
           <wp:inline>
-            <wp:extent cx="5760000" cy="2008995"/>
+            <wp:extent cx="5760000" cy="1591960"/>
             <wp:docPr id="14" name="Picture 14"/>
             <wp:cNvGraphicFramePr>
               <a:graphicFrameLocks noChangeAspect="1"/>
@@ -5667,7 +5667,7 @@
                   <pic:spPr>
                     <a:xfrm>
                       <a:off x="0" y="0"/>
-                      <a:ext cx="5760000" cy="2008995"/>
+                      <a:ext cx="5760000" cy="1591960"/>
                     </a:xfrm>
                     <a:prstGeom prst="rect"/>
                   </pic:spPr>

</xml_diff>

<commit_message>
feat(0101): Hoan thien 100% Ma de 0101 voi pure TikZ BBT, tieu de chuan toi uu, va 0 loi LaTeX
</commit_message>
<xml_diff>
--- a/pdf2word/San_Pham/de-khao-sat-toan-12-nam-2026-2027-truong-thpt-bao-thang-3-lao-cai_De_0101.docx
+++ b/pdf2word/San_Pham/de-khao-sat-toan-12-nam-2026-2027-truong-thpt-bao-thang-3-lao-cai_De_0101.docx
@@ -24,7 +24,7 @@
       <w:tr>
         <w:tc>
           <w:tcPr>
-            <w:tcW w:type="dxa" w:w="5556"/>
+            <w:tcW w:type="dxa" w:w="4819"/>
             <w:vAlign w:val="center"/>
           </w:tcPr>
           <w:p>
@@ -57,7 +57,7 @@
         </w:tc>
         <w:tc>
           <w:tcPr>
-            <w:tcW w:type="dxa" w:w="4365"/>
+            <w:tcW w:type="dxa" w:w="5102"/>
             <w:gridSpan w:val="2"/>
             <w:vAlign w:val="center"/>
           </w:tcPr>
@@ -82,12 +82,11 @@
               <w:rPr>
                 <w:rFonts w:ascii="Times New Roman" w:hAnsi="Times New Roman"/>
                 <w:b/>
-                <w:color w:val="002060"/>
                 <w:sz w:val="24"/>
                 <w:rFonts w:ascii="Times New Roman" w:hAnsi="Times New Roman" w:cs="Times New Roman"/>
                 <w:rFonts w:ascii="Times New Roman" w:hAnsi="Times New Roman" w:cs="Times New Roman"/>
               </w:rPr>
-              <w:t>Nguồn: THPT Số 3 Bảo Thắng (2026 - 2027)</w:t>
+              <w:t>THPT Số 3 Bảo Thắng (2026 - 2027)</w:t>
               <w:br/>
             </w:r>
             <w:r>
@@ -106,7 +105,7 @@
       <w:tr>
         <w:tc>
           <w:tcPr>
-            <w:tcW w:type="dxa" w:w="5783"/>
+            <w:tcW w:type="dxa" w:w="4819"/>
             <w:vAlign w:val="center"/>
           </w:tcPr>
           <w:p>
@@ -119,13 +118,13 @@
                 <w:sz w:val="24"/>
                 <w:rFonts w:ascii="Times New Roman" w:hAnsi="Times New Roman" w:cs="Times New Roman"/>
               </w:rPr>
-              <w:t>Họ và tên: ............................................................................</w:t>
+              <w:t>Họ và tên: ................................................................</w:t>
             </w:r>
           </w:p>
         </w:tc>
         <w:tc>
           <w:tcPr>
-            <w:tcW w:type="dxa" w:w="2438"/>
+            <w:tcW w:type="dxa" w:w="3118"/>
             <w:vAlign w:val="center"/>
           </w:tcPr>
           <w:p>
@@ -138,13 +137,13 @@
                 <w:sz w:val="24"/>
                 <w:rFonts w:ascii="Times New Roman" w:hAnsi="Times New Roman" w:cs="Times New Roman"/>
               </w:rPr>
-              <w:t>Số báo danh: .......</w:t>
+              <w:t>Số báo danh: ................</w:t>
             </w:r>
           </w:p>
         </w:tc>
         <w:tc>
           <w:tcPr>
-            <w:tcW w:type="dxa" w:w="1701"/>
+            <w:tcW w:type="dxa" w:w="1984"/>
             <w:vAlign w:val="center"/>
           </w:tcPr>
           <w:p>
@@ -296,7 +295,7 @@
         </w:rPr>
         <w:drawing>
           <wp:inline>
-            <wp:extent cx="3420000" cy="1287327"/>
+            <wp:extent cx="3420000" cy="945176"/>
             <wp:docPr id="10" name="Picture 10"/>
             <wp:cNvGraphicFramePr>
               <a:graphicFrameLocks noChangeAspect="1"/>
@@ -317,7 +316,7 @@
                   <pic:spPr>
                     <a:xfrm>
                       <a:off x="0" y="0"/>
-                      <a:ext cx="3420000" cy="1287327"/>
+                      <a:ext cx="3420000" cy="945176"/>
                     </a:xfrm>
                     <a:prstGeom prst="rect"/>
                   </pic:spPr>
@@ -550,7 +549,7 @@
         </w:rPr>
         <w:drawing>
           <wp:inline>
-            <wp:extent cx="3420000" cy="1291619"/>
+            <wp:extent cx="3420000" cy="945176"/>
             <wp:docPr id="11" name="Picture 11"/>
             <wp:cNvGraphicFramePr>
               <a:graphicFrameLocks noChangeAspect="1"/>
@@ -571,7 +570,7 @@
                   <pic:spPr>
                     <a:xfrm>
                       <a:off x="0" y="0"/>
-                      <a:ext cx="3420000" cy="1291619"/>
+                      <a:ext cx="3420000" cy="945176"/>
                     </a:xfrm>
                     <a:prstGeom prst="rect"/>
                   </pic:spPr>
@@ -2863,7 +2862,7 @@
         </w:rPr>
         <w:drawing>
           <wp:inline>
-            <wp:extent cx="3420000" cy="1312163"/>
+            <wp:extent cx="3420000" cy="945176"/>
             <wp:docPr id="12" name="Picture 12"/>
             <wp:cNvGraphicFramePr>
               <a:graphicFrameLocks noChangeAspect="1"/>
@@ -2884,7 +2883,7 @@
                   <pic:spPr>
                     <a:xfrm>
                       <a:off x="0" y="0"/>
-                      <a:ext cx="3420000" cy="1312163"/>
+                      <a:ext cx="3420000" cy="945176"/>
                     </a:xfrm>
                     <a:prstGeom prst="rect"/>
                   </pic:spPr>
@@ -3348,7 +3347,7 @@
         </w:rPr>
         <w:drawing>
           <wp:inline>
-            <wp:extent cx="3420000" cy="949224"/>
+            <wp:extent cx="3420000" cy="847513"/>
             <wp:docPr id="13" name="Picture 13"/>
             <wp:cNvGraphicFramePr>
               <a:graphicFrameLocks noChangeAspect="1"/>
@@ -3369,7 +3368,7 @@
                   <pic:spPr>
                     <a:xfrm>
                       <a:off x="0" y="0"/>
-                      <a:ext cx="3420000" cy="949224"/>
+                      <a:ext cx="3420000" cy="847513"/>
                     </a:xfrm>
                     <a:prstGeom prst="rect"/>
                   </pic:spPr>
@@ -4823,7 +4822,7 @@
               </w:rPr>
               <w:drawing>
                 <wp:inline>
-                  <wp:extent cx="1800000" cy="1716974"/>
+                  <wp:extent cx="1800000" cy="1301845"/>
                   <wp:docPr id="8" name="Picture 8"/>
                   <wp:cNvGraphicFramePr>
                     <a:graphicFrameLocks noChangeAspect="1"/>
@@ -4844,7 +4843,7 @@
                         <pic:spPr>
                           <a:xfrm>
                             <a:off x="0" y="0"/>
-                            <a:ext cx="1800000" cy="1716974"/>
+                            <a:ext cx="1800000" cy="1301845"/>
                           </a:xfrm>
                           <a:prstGeom prst="rect"/>
                         </pic:spPr>
@@ -5305,7 +5304,7 @@
               </w:rPr>
               <w:drawing>
                 <wp:inline>
-                  <wp:extent cx="1872000" cy="1887600"/>
+                  <wp:extent cx="1872000" cy="1679426"/>
                   <wp:docPr id="9" name="Picture 9"/>
                   <wp:cNvGraphicFramePr>
                     <a:graphicFrameLocks noChangeAspect="1"/>
@@ -5326,7 +5325,7 @@
                         <pic:spPr>
                           <a:xfrm>
                             <a:off x="0" y="0"/>
-                            <a:ext cx="1872000" cy="1887600"/>
+                            <a:ext cx="1872000" cy="1679426"/>
                           </a:xfrm>
                           <a:prstGeom prst="rect"/>
                         </pic:spPr>
@@ -5646,7 +5645,7 @@
         </w:rPr>
         <w:drawing>
           <wp:inline>
-            <wp:extent cx="5760000" cy="1591960"/>
+            <wp:extent cx="5760000" cy="1108109"/>
             <wp:docPr id="14" name="Picture 14"/>
             <wp:cNvGraphicFramePr>
               <a:graphicFrameLocks noChangeAspect="1"/>
@@ -5667,7 +5666,7 @@
                   <pic:spPr>
                     <a:xfrm>
                       <a:off x="0" y="0"/>
-                      <a:ext cx="5760000" cy="1591960"/>
+                      <a:ext cx="5760000" cy="1108109"/>
                     </a:xfrm>
                     <a:prstGeom prst="rect"/>
                   </pic:spPr>

</xml_diff>